<commit_message>
Bring user guide current with Passages, Hand-grading, and Sync Trait Choices
The guide had fallen behind three features added after it was written:
Passages (new tab + section), the GradingMode Hand-grading opt-out
(new tab column + section), and Sync Trait Choices to Form - which
also meant the existing "add a new trait" instructions were actively
wrong (told editors to hand-edit the Form, when that's now a one-click
menu action). Sections renumbered accordingly.

Co-Authored-By: Claude Sonnet 5 <noreply@anthropic.com>
Claude-Session: https://claude.ai/code/session_01NQM2DxHTg39qsrc3XSnEYS
</commit_message>
<xml_diff>
--- a/apps-script/Formative-Grader-User-Guide.docx
+++ b/apps-script/Formative-Grader-User-Guide.docx
@@ -128,7 +128,7 @@
         <w:spacing w:after="150" w:before="400"/>
       </w:pPr>
       <w:r>
-        <w:t xml:space="preserve">3. The four tabs</w:t>
+        <w:t xml:space="preserve">3. The five tabs</w:t>
       </w:r>
     </w:p>
     <w:tbl>
@@ -273,7 +273,7 @@
                 <w:b w:val="false"/>
                 <w:bCs w:val="false"/>
               </w:rPr>
-              <w:t xml:space="preserve">One row per student: ID, name, email, teacher. The only tab where a student’s number and real name sit next to each other.</w:t>
+              <w:t xml:space="preserve">One row per student: ID, name, email, teacher, and grading mode. The only tab where a student’s number and real name sit next to each other.</w:t>
             </w:r>
           </w:p>
         </w:tc>
@@ -357,7 +357,7 @@
                 <w:b w:val="false"/>
                 <w:bCs w:val="false"/>
               </w:rPr>
-              <w:t xml:space="preserve">Results</w:t>
+              <w:t xml:space="preserve">Passages</w:t>
             </w:r>
           </w:p>
         </w:tc>
@@ -377,7 +377,7 @@
                 <w:b w:val="false"/>
                 <w:bCs w:val="false"/>
               </w:rPr>
-              <w:t xml:space="preserve">The script (automatic)</w:t>
+              <w:t xml:space="preserve">Anyone with Editor access</w:t>
             </w:r>
           </w:p>
         </w:tc>
@@ -397,7 +397,7 @@
                 <w:b w:val="false"/>
                 <w:bCs w:val="false"/>
               </w:rPr>
-              <w:t xml:space="preserve">Every score, written by the script the moment a student submits. One exception below.</w:t>
+              <w:t xml:space="preserve">One row per week that analyzes a specific text (tone, rhetorical devices, etc.) — the passage itself, so Claude can check the analysis against it. Most weeks won’t need a row here.</w:t>
             </w:r>
           </w:p>
         </w:tc>
@@ -419,6 +419,68 @@
                 <w:b w:val="false"/>
                 <w:bCs w:val="false"/>
               </w:rPr>
+              <w:t xml:space="preserve">Results</w:t>
+            </w:r>
+          </w:p>
+        </w:tc>
+        <w:tc>
+          <w:tcPr>
+            <w:tcW w:type="dxa" w:w="2000"/>
+            <w:tcMar>
+              <w:top w:type="dxa" w:w="100"/>
+              <w:left w:type="dxa" w:w="120"/>
+              <w:bottom w:type="dxa" w:w="100"/>
+              <w:right w:type="dxa" w:w="120"/>
+            </w:tcMar>
+          </w:tcPr>
+          <w:p>
+            <w:r>
+              <w:rPr>
+                <w:b w:val="false"/>
+                <w:bCs w:val="false"/>
+              </w:rPr>
+              <w:t xml:space="preserve">The script (automatic)</w:t>
+            </w:r>
+          </w:p>
+        </w:tc>
+        <w:tc>
+          <w:tcPr>
+            <w:tcW w:type="dxa" w:w="5460"/>
+            <w:tcMar>
+              <w:top w:type="dxa" w:w="100"/>
+              <w:left w:type="dxa" w:w="120"/>
+              <w:bottom w:type="dxa" w:w="100"/>
+              <w:right w:type="dxa" w:w="120"/>
+            </w:tcMar>
+          </w:tcPr>
+          <w:p>
+            <w:r>
+              <w:rPr>
+                <w:b w:val="false"/>
+                <w:bCs w:val="false"/>
+              </w:rPr>
+              <w:t xml:space="preserve">Every score, written by the script the moment a student submits. One exception below.</w:t>
+            </w:r>
+          </w:p>
+        </w:tc>
+      </w:tr>
+      <w:tr>
+        <w:tc>
+          <w:tcPr>
+            <w:tcW w:type="dxa" w:w="1900"/>
+            <w:tcMar>
+              <w:top w:type="dxa" w:w="100"/>
+              <w:left w:type="dxa" w:w="120"/>
+              <w:bottom w:type="dxa" w:w="100"/>
+              <w:right w:type="dxa" w:w="120"/>
+            </w:tcMar>
+          </w:tcPr>
+          <w:p>
+            <w:r>
+              <w:rPr>
+                <w:b w:val="false"/>
+                <w:bCs w:val="false"/>
+              </w:rPr>
               <w:t xml:space="preserve">Errors</w:t>
             </w:r>
           </w:p>
@@ -475,7 +537,7 @@
           <w:i/>
           <w:iCs/>
         </w:rPr>
-        <w:t xml:space="preserve">Note: Don’t type into the Results tab except the one column meant for it: TeacherHandScore, used during PLC norming to compare a teacher’s own score against the AI’s. The Gap column next to it calculates the difference automatically — you don’t need to touch it. Editing a score by hand elsewhere in that row does not re-run anything; it just overwrites what the AI reported.</w:t>
+        <w:t xml:space="preserve">Note: Don’t type into the Results tab except the one column meant for it: TeacherHandScore, used both during PLC norming (to compare a teacher’s own score against the AI’s) and as the actual grade for Hand-graded students (Section 7). The Gap column next to it calculates the difference automatically — you don’t need to touch it. Editing a score by hand elsewhere in that row does not re-run anything; it just overwrites what the AI reported.</w:t>
       </w:r>
     </w:p>
     <w:p>
@@ -510,7 +572,20 @@
         <w:spacing w:after="80"/>
       </w:pPr>
       <w:r>
-        <w:t xml:space="preserve">Add a new row: Student ID, Name, Email, Teacher.</w:t>
+        <w:t xml:space="preserve">Add a new row: Student ID, Name, Email, Teacher, and GradingMode.</w:t>
+      </w:r>
+    </w:p>
+    <w:p>
+      <w:pPr>
+        <w:pStyle w:val="ListParagraph"/>
+        <w:numPr>
+          <w:ilvl w:val="0"/>
+          <w:numId w:val="2"/>
+        </w:numPr>
+        <w:spacing w:after="80"/>
+      </w:pPr>
+      <w:r>
+        <w:t xml:space="preserve">Leave GradingMode blank for normal AI scoring. Only set it to “Hand” for a teacher whose students should never be sent to Claude at all — see Section 7 before using this.</w:t>
       </w:r>
     </w:p>
     <w:p>
@@ -536,7 +611,7 @@
           <w:i/>
           <w:iCs/>
         </w:rPr>
-        <w:t xml:space="preserve">Note: If you try to type into Roster and it won’t let you, that’s expected for anyone who hasn’t specifically been added as an editor of that one tab — see Section 7.</w:t>
+        <w:t xml:space="preserve">Note: If you try to type into Roster and it won’t let you, that’s expected for anyone who hasn’t specifically been added as an editor of that one tab — see Section 9.</w:t>
       </w:r>
     </w:p>
     <w:p>
@@ -589,6 +664,19 @@
     </w:p>
     <w:p>
       <w:pPr>
+        <w:pStyle w:val="ListParagraph"/>
+        <w:numPr>
+          <w:ilvl w:val="0"/>
+          <w:numId w:val="2"/>
+        </w:numPr>
+        <w:spacing w:after="80"/>
+      </w:pPr>
+      <w:r>
+        <w:t xml:space="preserve">Adding a brand-new trait (not just updating an existing one’s wording)? After adding its row here, go to the Formative Grader menu and run “Sync Trait Choices to Form” — it automatically rewrites the Form’s checkbox list to match this tab. You never need to edit the Form by hand for this.</w:t>
+      </w:r>
+    </w:p>
+    <w:p>
+      <w:pPr>
         <w:shd w:fill="FFF2CC" w:val="clear"/>
         <w:spacing w:after="200" w:before="100"/>
       </w:pPr>
@@ -597,20 +685,7 @@
           <w:i/>
           <w:iCs/>
         </w:rPr>
-        <w:t xml:space="preserve">Note: Adding a brand-new trait (not just updating an existing one’s wording) means it also needs to become a checkbox choice on the live Form, since the Form doesn’t automatically stay in sync with this tab. Open the Form directly and add it as a choice under the Trait(s) question. Ask the person who set this up if you’re not sure where that is.</w:t>
-      </w:r>
-    </w:p>
-    <w:p>
-      <w:pPr>
-        <w:shd w:fill="FFF2CC" w:val="clear"/>
-        <w:spacing w:after="200" w:before="100"/>
-      </w:pPr>
-      <w:r>
-        <w:rPr>
-          <w:i/>
-          <w:iCs/>
-        </w:rPr>
-        <w:t xml:space="preserve">Note: To change an existing trait’s rubric — revising it for a new year, for instance — just edit that same row’s RubricSource. You don’t need a new row. Past scores already on the Results tab won’t change; only submissions from that point on use the new version.</w:t>
+        <w:t xml:space="preserve">Note: To change an existing trait’s rubric — revising it for a new year, for instance — just edit that same row’s RubricSource. You don’t need a new row, and you don’t need to sync the Form (the trait’s name isn’t changing, just what’s behind it). Past scores already on the Results tab won’t change; only submissions from that point on use the new version.</w:t>
       </w:r>
     </w:p>
     <w:p>
@@ -619,7 +694,7 @@
         <w:spacing w:after="150" w:before="400"/>
       </w:pPr>
       <w:r>
-        <w:t xml:space="preserve">6. Starting a new grading cycle</w:t>
+        <w:t xml:space="preserve">6. Passage-based formatives</w:t>
       </w:r>
     </w:p>
     <w:p>
@@ -633,46 +708,59 @@
           <w:i w:val="false"/>
           <w:iCs w:val="false"/>
         </w:rPr>
-        <w:t xml:space="preserve">“Cycle” just means which semester or run this is — it keeps a future “Week 2” from being confused with this year’s “Week 2” in the Results tab.</w:t>
-      </w:r>
-    </w:p>
-    <w:p>
-      <w:pPr>
-        <w:pStyle w:val="ListParagraph"/>
-        <w:numPr>
-          <w:ilvl w:val="0"/>
-          <w:numId w:val="2"/>
-        </w:numPr>
-        <w:spacing w:after="80"/>
-      </w:pPr>
-      <w:r>
-        <w:t xml:space="preserve">From the Formative Grader menu, choose “Set Current Cycle...”</w:t>
-      </w:r>
-    </w:p>
-    <w:p>
-      <w:pPr>
-        <w:pStyle w:val="ListParagraph"/>
-        <w:numPr>
-          <w:ilvl w:val="0"/>
-          <w:numId w:val="2"/>
-        </w:numPr>
-        <w:spacing w:after="80"/>
-      </w:pPr>
-      <w:r>
-        <w:t xml:space="preserve">Type a label — “Fall 2026”, for example.</w:t>
-      </w:r>
-    </w:p>
-    <w:p>
-      <w:pPr>
-        <w:pStyle w:val="ListParagraph"/>
-        <w:numPr>
-          <w:ilvl w:val="0"/>
-          <w:numId w:val="2"/>
-        </w:numPr>
-        <w:spacing w:after="80"/>
-      </w:pPr>
-      <w:r>
-        <w:t xml:space="preserve">Every submission from that point on is stamped with this label automatically, until it’s changed again. Do this once at the start of each new semester or year, not for every individual formative.</w:t>
+        <w:t xml:space="preserve">Some formatives ask students to analyze a specific passage — identifying tone, rhetorical devices, and so on — rather than just make their own argument. For these, the rubric alone isn’t enough: Claude also needs the actual passage, or it can only judge whether the analysis sounds plausible, not whether it’s actually true of the text.</w:t>
+      </w:r>
+    </w:p>
+    <w:p>
+      <w:pPr>
+        <w:pStyle w:val="ListParagraph"/>
+        <w:numPr>
+          <w:ilvl w:val="0"/>
+          <w:numId w:val="2"/>
+        </w:numPr>
+        <w:spacing w:after="80"/>
+      </w:pPr>
+      <w:r>
+        <w:t xml:space="preserve">Open the Passages tab.</w:t>
+      </w:r>
+    </w:p>
+    <w:p>
+      <w:pPr>
+        <w:pStyle w:val="ListParagraph"/>
+        <w:numPr>
+          <w:ilvl w:val="0"/>
+          <w:numId w:val="2"/>
+        </w:numPr>
+        <w:spacing w:after="80"/>
+      </w:pPr>
+      <w:r>
+        <w:t xml:space="preserve">Add a row: the current Cycle, the Week number, and the passage itself under SourceText — pasted text or a linked Google Doc, same as a rubric.</w:t>
+      </w:r>
+    </w:p>
+    <w:p>
+      <w:pPr>
+        <w:pStyle w:val="ListParagraph"/>
+        <w:numPr>
+          <w:ilvl w:val="0"/>
+          <w:numId w:val="2"/>
+        </w:numPr>
+        <w:spacing w:after="80"/>
+      </w:pPr>
+      <w:r>
+        <w:t xml:space="preserve">That’s it. The same passage is used for every teacher and every trait scored that week — you set it once per week, not once per class.</w:t>
+      </w:r>
+    </w:p>
+    <w:p>
+      <w:pPr>
+        <w:shd w:fill="FFF2CC" w:val="clear"/>
+        <w:spacing w:after="200" w:before="100"/>
+      </w:pPr>
+      <w:r>
+        <w:rPr>
+          <w:i/>
+          <w:iCs/>
+        </w:rPr>
+        <w:t xml:space="preserve">Note: Most weeks don’t need a row here at all — CER writing checks like Claim Clarity are scored purely from the student’s own writing, with nothing to look up. Only add a row for a week that specifically analyzes a text.</w:t>
       </w:r>
     </w:p>
     <w:p>
@@ -681,7 +769,119 @@
         <w:spacing w:after="150" w:before="400"/>
       </w:pPr>
       <w:r>
-        <w:t xml:space="preserve">7. Giving someone Editor access — what it actually includes</w:t>
+        <w:t xml:space="preserve">7. Hand-grading opt-out</w:t>
+      </w:r>
+    </w:p>
+    <w:p>
+      <w:pPr>
+        <w:spacing w:after="120"/>
+      </w:pPr>
+      <w:r>
+        <w:rPr>
+          <w:b w:val="false"/>
+          <w:bCs w:val="false"/>
+          <w:i w:val="false"/>
+          <w:iCs w:val="false"/>
+        </w:rPr>
+        <w:t xml:space="preserve">Some teachers may not want their students’ writing sent to an AI at all, as a matter of principle — not just objecting to being scored by it. Setting a student’s GradingMode to “Hand” on the Roster tab guarantees that: the check happens before the script does anything else with that submission, so it is never sent anywhere near Claude.</w:t>
+      </w:r>
+    </w:p>
+    <w:p>
+      <w:pPr>
+        <w:spacing w:after="120"/>
+      </w:pPr>
+      <w:r>
+        <w:rPr>
+          <w:b w:val="false"/>
+          <w:bCs w:val="false"/>
+          <w:i w:val="false"/>
+          <w:iCs w:val="false"/>
+        </w:rPr>
+        <w:t xml:space="preserve">Their submissions still come in through the same Form and still land in the same Results tab, one row per trait, so the whole department stays comparable in one place — but every AI-generated field is left blank except a short note explaining why. You fill in TeacherHandScore by hand once you’ve graded the paper yourself; that’s the row’s real grade.</w:t>
+      </w:r>
+    </w:p>
+    <w:p>
+      <w:pPr>
+        <w:shd w:fill="FFF2CC" w:val="clear"/>
+        <w:spacing w:after="200" w:before="100"/>
+      </w:pPr>
+      <w:r>
+        <w:rPr>
+          <w:i/>
+          <w:iCs/>
+        </w:rPr>
+        <w:t xml:space="preserve">Note: Two things this deliberately skips for Hand-graded rows: no automated feedback email goes out (there’s no AI-written note to send — you’re expected to give your own feedback directly), and the Gap column stays blank for these rows, since there’s no AI score to compare against.</w:t>
+      </w:r>
+    </w:p>
+    <w:p>
+      <w:pPr>
+        <w:pStyle w:val="Heading1"/>
+        <w:spacing w:after="150" w:before="400"/>
+      </w:pPr>
+      <w:r>
+        <w:t xml:space="preserve">8. Starting a new grading cycle</w:t>
+      </w:r>
+    </w:p>
+    <w:p>
+      <w:pPr>
+        <w:spacing w:after="120"/>
+      </w:pPr>
+      <w:r>
+        <w:rPr>
+          <w:b w:val="false"/>
+          <w:bCs w:val="false"/>
+          <w:i w:val="false"/>
+          <w:iCs w:val="false"/>
+        </w:rPr>
+        <w:t xml:space="preserve">“Cycle” just means which semester or run this is — it keeps a future “Week 2” from being confused with this year’s “Week 2” in the Results tab.</w:t>
+      </w:r>
+    </w:p>
+    <w:p>
+      <w:pPr>
+        <w:pStyle w:val="ListParagraph"/>
+        <w:numPr>
+          <w:ilvl w:val="0"/>
+          <w:numId w:val="2"/>
+        </w:numPr>
+        <w:spacing w:after="80"/>
+      </w:pPr>
+      <w:r>
+        <w:t xml:space="preserve">From the Formative Grader menu, choose “Set Current Cycle...”</w:t>
+      </w:r>
+    </w:p>
+    <w:p>
+      <w:pPr>
+        <w:pStyle w:val="ListParagraph"/>
+        <w:numPr>
+          <w:ilvl w:val="0"/>
+          <w:numId w:val="2"/>
+        </w:numPr>
+        <w:spacing w:after="80"/>
+      </w:pPr>
+      <w:r>
+        <w:t xml:space="preserve">Type a label — “Fall 2026”, for example.</w:t>
+      </w:r>
+    </w:p>
+    <w:p>
+      <w:pPr>
+        <w:pStyle w:val="ListParagraph"/>
+        <w:numPr>
+          <w:ilvl w:val="0"/>
+          <w:numId w:val="2"/>
+        </w:numPr>
+        <w:spacing w:after="80"/>
+      </w:pPr>
+      <w:r>
+        <w:t xml:space="preserve">Every submission from that point on is stamped with this label automatically, until it’s changed again. Do this once at the start of each new semester or year, not for every individual formative.</w:t>
+      </w:r>
+    </w:p>
+    <w:p>
+      <w:pPr>
+        <w:pStyle w:val="Heading1"/>
+        <w:spacing w:after="150" w:before="400"/>
+      </w:pPr>
+      <w:r>
+        <w:t xml:space="preserve">9. Giving someone Editor access — what it actually includes</w:t>
       </w:r>
     </w:p>
     <w:p>
@@ -729,7 +929,7 @@
         <w:spacing w:after="150" w:before="400"/>
       </w:pPr>
       <w:r>
-        <w:t xml:space="preserve">8. If something looks wrong</w:t>
+        <w:t xml:space="preserve">10. If something looks wrong</w:t>
       </w:r>
     </w:p>
     <w:p>

</xml_diff>

<commit_message>
Fix user guide: stop implying every student email must be typed by hand
Section 4 listed Email as something to fill in manually for every new
roster row, but never mentioned the verified-email auto-fill feature
built earlier - the exact thing meant to remove that tedium. Now notes
Email can be left blank and backfills from the Form's verified email
on first submission, plus what a mismatch flag in Errors means.

Co-Authored-By: Claude Sonnet 5 <noreply@anthropic.com>
Claude-Session: https://claude.ai/code/session_01NQM2DxHTg39qsrc3XSnEYS
</commit_message>
<xml_diff>
--- a/apps-script/Formative-Grader-User-Guide.docx
+++ b/apps-script/Formative-Grader-User-Guide.docx
@@ -572,7 +572,7 @@
         <w:spacing w:after="80"/>
       </w:pPr>
       <w:r>
-        <w:t xml:space="preserve">Add a new row: Student ID, Name, Email, Teacher, and GradingMode.</w:t>
+        <w:t xml:space="preserve">Add a new row: Student ID, Name, Teacher, and GradingMode. You can leave Email blank — see the note below.</w:t>
       </w:r>
     </w:p>
     <w:p>
@@ -599,6 +599,19 @@
       </w:pPr>
       <w:r>
         <w:t xml:space="preserve">That’s it — nothing else needs to be told about a new student. But the student needs their assigned ID before they submit anything; the Form has no way to look up or assign one for them.</w:t>
+      </w:r>
+    </w:p>
+    <w:p>
+      <w:pPr>
+        <w:shd w:fill="FFF2CC" w:val="clear"/>
+        <w:spacing w:after="200" w:before="100"/>
+      </w:pPr>
+      <w:r>
+        <w:rPr>
+          <w:i/>
+          <w:iCs/>
+        </w:rPr>
+        <w:t xml:space="preserve">Note: You don’t have to type in every student’s email by hand. If a student’s Email cell is blank the first time they submit the Form, it fills in automatically from their verified school account — no copying required. (This relies on the Form’s “Collect email addresses” setting being on Verified; if emails aren’t auto-filling, ask whoever set this up to check that setting.) If a cell already has an email typed in and it later doesn’t match what the student actually submitted from, that gets flagged to the Errors tab rather than silently overwritten or ignored — worth a look, since it usually means a mistyped Student ID.</w:t>
       </w:r>
     </w:p>
     <w:p>

</xml_diff>